<commit_message>
Fix Lesson 7 Report
</commit_message>
<xml_diff>
--- a/Lesson7/Lesson7Report.docx
+++ b/Lesson7/Lesson7Report.docx
@@ -181,13 +181,25 @@
         <w:rPr>
           <w:color w:val="215E99" w:themeColor="text2" w:themeTint="BF"/>
         </w:rPr>
-        <w:t xml:space="preserve">Lesson 2: </w:t>
+        <w:t xml:space="preserve">Lesson </w:t>
       </w:r>
       <w:r>
         <w:rPr>
           <w:color w:val="215E99" w:themeColor="text2" w:themeTint="BF"/>
         </w:rPr>
-        <w:t>Broken Authentication</w:t>
+        <w:t>7</w:t>
+      </w:r>
+      <w:r>
+        <w:rPr>
+          <w:color w:val="215E99" w:themeColor="text2" w:themeTint="BF"/>
+        </w:rPr>
+        <w:t xml:space="preserve">: </w:t>
+      </w:r>
+      <w:r>
+        <w:rPr>
+          <w:color w:val="215E99" w:themeColor="text2" w:themeTint="BF"/>
+        </w:rPr>
+        <w:t>Over-Privileged Functions</w:t>
       </w:r>
     </w:p>
     <w:p>

</xml_diff>